<commit_message>
adding additional onshore wind sites to Korea pipeline
</commit_message>
<xml_diff>
--- a/data/weather/Site Selection Methodology for Wind Data.docx
+++ b/data/weather/Site Selection Methodology for Wind Data.docx
@@ -1,6 +1,6 @@
 
 <file path=word/document.xml><?xml version="1.0" encoding="utf-8"?>
-<w:document xmlns:wpc="http://schemas.microsoft.com/office/word/2010/wordprocessingCanvas" xmlns:cx="http://schemas.microsoft.com/office/drawing/2014/chartex" xmlns:cx1="http://schemas.microsoft.com/office/drawing/2015/9/8/chartex" xmlns:cx2="http://schemas.microsoft.com/office/drawing/2015/10/21/chartex" xmlns:cx3="http://schemas.microsoft.com/office/drawing/2016/5/9/chartex" xmlns:cx4="http://schemas.microsoft.com/office/drawing/2016/5/10/chartex" xmlns:cx5="http://schemas.microsoft.com/office/drawing/2016/5/11/chartex" xmlns:cx6="http://schemas.microsoft.com/office/drawing/2016/5/12/chartex" xmlns:cx7="http://schemas.microsoft.com/office/drawing/2016/5/13/chartex" xmlns:cx8="http://schemas.microsoft.com/office/drawing/2016/5/14/chartex" xmlns:mc="http://schemas.openxmlformats.org/markup-compatibility/2006" xmlns:aink="http://schemas.microsoft.com/office/drawing/2016/ink" xmlns:am3d="http://schemas.microsoft.com/office/drawing/2017/model3d" xmlns:o="urn:schemas-microsoft-com:office:office" xmlns:oel="http://schemas.microsoft.com/office/2019/extlst" xmlns:r="http://schemas.openxmlformats.org/officeDocument/2006/relationships" xmlns:m="http://schemas.openxmlformats.org/officeDocument/2006/math" xmlns:v="urn:schemas-microsoft-com:vml" xmlns:wp14="http://schemas.microsoft.com/office/word/2010/wordprocessingDrawing" xmlns:wp="http://schemas.openxmlformats.org/drawingml/2006/wordprocessingDrawing" xmlns:w10="urn:schemas-microsoft-com:office:word" xmlns:w="http://schemas.openxmlformats.org/wordprocessingml/2006/main" xmlns:w14="http://schemas.microsoft.com/office/word/2010/wordml" xmlns:w15="http://schemas.microsoft.com/office/word/2012/wordml" xmlns:w16cex="http://schemas.microsoft.com/office/word/2018/wordml/cex" xmlns:w16cid="http://schemas.microsoft.com/office/word/2016/wordml/cid" xmlns:w16="http://schemas.microsoft.com/office/word/2018/wordml" xmlns:w16du="http://schemas.microsoft.com/office/word/2023/wordml/word16du" xmlns:w16sdtdh="http://schemas.microsoft.com/office/word/2020/wordml/sdtdatahash" xmlns:w16sdtfl="http://schemas.microsoft.com/office/word/2024/wordml/sdtformatlock" xmlns:w16se="http://schemas.microsoft.com/office/word/2015/wordml/symex" xmlns:wpg="http://schemas.microsoft.com/office/word/2010/wordprocessingGroup" xmlns:wpi="http://schemas.microsoft.com/office/word/2010/wordprocessingInk" xmlns:wne="http://schemas.microsoft.com/office/word/2006/wordml" xmlns:wps="http://schemas.microsoft.com/office/word/2010/wordprocessingShape" mc:Ignorable="w14 w15 w16se w16cid w16 w16cex w16sdtdh w16sdtfl w16du wp14">
+<w:document xmlns:wpc="http://schemas.microsoft.com/office/word/2010/wordprocessingCanvas" xmlns:cx="http://schemas.microsoft.com/office/drawing/2014/chartex" xmlns:cx1="http://schemas.microsoft.com/office/drawing/2015/9/8/chartex" xmlns:cx2="http://schemas.microsoft.com/office/drawing/2015/10/21/chartex" xmlns:cx3="http://schemas.microsoft.com/office/drawing/2016/5/9/chartex" xmlns:cx4="http://schemas.microsoft.com/office/drawing/2016/5/10/chartex" xmlns:cx5="http://schemas.microsoft.com/office/drawing/2016/5/11/chartex" xmlns:cx6="http://schemas.microsoft.com/office/drawing/2016/5/12/chartex" xmlns:cx7="http://schemas.microsoft.com/office/drawing/2016/5/13/chartex" xmlns:cx8="http://schemas.microsoft.com/office/drawing/2016/5/14/chartex" xmlns:mc="http://schemas.openxmlformats.org/markup-compatibility/2006" xmlns:aink="http://schemas.microsoft.com/office/drawing/2016/ink" xmlns:am3d="http://schemas.microsoft.com/office/drawing/2017/model3d" xmlns:o="urn:schemas-microsoft-com:office:office" xmlns:oel="http://schemas.microsoft.com/office/2019/extlst" xmlns:r="http://schemas.openxmlformats.org/officeDocument/2006/relationships" xmlns:m="http://schemas.openxmlformats.org/officeDocument/2006/math" xmlns:v="urn:schemas-microsoft-com:vml" xmlns:wp14="http://schemas.microsoft.com/office/word/2010/wordprocessingDrawing" xmlns:wp="http://schemas.openxmlformats.org/drawingml/2006/wordprocessingDrawing" xmlns:w10="urn:schemas-microsoft-com:office:word" xmlns:w="http://schemas.openxmlformats.org/wordprocessingml/2006/main" xmlns:w14="http://schemas.microsoft.com/office/word/2010/wordml" xmlns:w15="http://schemas.microsoft.com/office/word/2012/wordml" xmlns:w16cei="http://schemas.microsoft.com/office/word/2026/wordml/cei" xmlns:w16cex="http://schemas.microsoft.com/office/word/2018/wordml/cex" xmlns:w16cid="http://schemas.microsoft.com/office/word/2016/wordml/cid" xmlns:w16="http://schemas.microsoft.com/office/word/2018/wordml" xmlns:w16du="http://schemas.microsoft.com/office/word/2023/wordml/word16du" xmlns:w16sdtdh="http://schemas.microsoft.com/office/word/2020/wordml/sdtdatahash" xmlns:w16sdtfl="http://schemas.microsoft.com/office/word/2024/wordml/sdtformatlock" xmlns:w16se="http://schemas.microsoft.com/office/word/2015/wordml/symex" xmlns:wpg="http://schemas.microsoft.com/office/word/2010/wordprocessingGroup" xmlns:wpi="http://schemas.microsoft.com/office/word/2010/wordprocessingInk" xmlns:wne="http://schemas.microsoft.com/office/word/2006/wordml" xmlns:wps="http://schemas.microsoft.com/office/word/2010/wordprocessingShape" mc:Ignorable="w14 w15 w16se w16cid w16 w16cex w16sdtdh w16sdtfl w16du wp14">
   <w:body>
     <w:p>
       <w:pPr>
@@ -26,15 +26,7 @@
     </w:p>
     <w:p>
       <w:r>
-        <w:t xml:space="preserve">Outside the EU, </w:t>
-      </w:r>
-      <w:proofErr w:type="spellStart"/>
-      <w:r>
-        <w:t>Renewables.ninja</w:t>
-      </w:r>
-      <w:proofErr w:type="spellEnd"/>
-      <w:r>
-        <w:t xml:space="preserve"> does not offer pre-aggregated national wind-output (capacity-factor) time series for </w:t>
+        <w:t xml:space="preserve">Outside the EU, Renewables.ninja does not offer pre-aggregated national wind-output (capacity-factor) time series for </w:t>
       </w:r>
       <w:proofErr w:type="gramStart"/>
       <w:r>
@@ -42,23 +34,7 @@
       </w:r>
       <w:proofErr w:type="gramEnd"/>
       <w:r>
-        <w:t xml:space="preserve"> those bulk "country" datasets exist only for European countries. For the rest of the world, including China and South Korea, only point (single </w:t>
-      </w:r>
-      <w:proofErr w:type="spellStart"/>
-      <w:r>
-        <w:t>lat</w:t>
-      </w:r>
-      <w:proofErr w:type="spellEnd"/>
-      <w:r>
-        <w:t>/</w:t>
-      </w:r>
-      <w:proofErr w:type="spellStart"/>
-      <w:r>
-        <w:t>lon</w:t>
-      </w:r>
-      <w:proofErr w:type="spellEnd"/>
-      <w:r>
-        <w:t>) simulations are available, through the token-authenticated API.</w:t>
+        <w:t xml:space="preserve"> those bulk "country" datasets exist only for European countries. For the rest of the world, including China and South Korea, only point (single lat/lon) simulations are available, through the token-authenticated API.</w:t>
       </w:r>
     </w:p>
     <w:p>
@@ -66,6 +42,9 @@
         <w:keepNext/>
       </w:pPr>
       <w:r>
+        <w:rPr>
+          <w:noProof/>
+        </w:rPr>
         <w:drawing>
           <wp:inline distT="0" distB="0" distL="0" distR="0" wp14:anchorId="5C50FA06" wp14:editId="0FEEB467">
             <wp:extent cx="5943600" cy="3324860"/>
@@ -110,39 +89,21 @@
       <w:r>
         <w:t xml:space="preserve">Figure </w:t>
       </w:r>
-      <w:r>
-        <w:fldChar w:fldCharType="begin"/>
-      </w:r>
-      <w:r>
-        <w:instrText xml:space="preserve"> SEQ Figure \* ARABIC </w:instrText>
-      </w:r>
-      <w:r>
-        <w:fldChar w:fldCharType="separate"/>
-      </w:r>
-      <w:r>
-        <w:rPr>
-          <w:noProof/>
-        </w:rPr>
-        <w:t>1</w:t>
-      </w:r>
-      <w:r>
-        <w:fldChar w:fldCharType="end"/>
-      </w:r>
+      <w:fldSimple w:instr=" SEQ Figure \* ARABIC ">
+        <w:r>
+          <w:rPr>
+            <w:noProof/>
+          </w:rPr>
+          <w:t>1</w:t>
+        </w:r>
+      </w:fldSimple>
       <w:r>
         <w:t xml:space="preserve"> Example Manual Wind Power Output Call</w:t>
       </w:r>
     </w:p>
     <w:p>
       <w:r>
-        <w:t xml:space="preserve">Reproducing the </w:t>
-      </w:r>
-      <w:proofErr w:type="spellStart"/>
-      <w:r>
-        <w:t>Staffell</w:t>
-      </w:r>
-      <w:proofErr w:type="spellEnd"/>
-      <w:r>
-        <w:t xml:space="preserve"> &amp; Pfenninger (2016) "Virtual Wind Farm"</w:t>
+        <w:t>Reproducing the Staffell &amp; Pfenninger (2016) "Virtual Wind Farm"</w:t>
       </w:r>
       <w:r>
         <w:rPr>
@@ -151,15 +112,7 @@
         <w:footnoteReference w:id="1"/>
       </w:r>
       <w:r>
-        <w:t xml:space="preserve"> methodology ourselves at national scale would mean simulating every reanalysis grid cell, weighting by the actual turbine-fleet distribution, and bias-correcting against metered national output — data- and compute-intensive work that </w:t>
-      </w:r>
-      <w:proofErr w:type="spellStart"/>
-      <w:r>
-        <w:t>Renewables.ninja</w:t>
-      </w:r>
-      <w:proofErr w:type="spellEnd"/>
-      <w:r>
-        <w:t xml:space="preserve"> has already performed. It is far more efficient to reuse its already-computed point outputs at representative locations.</w:t>
+        <w:t xml:space="preserve"> methodology ourselves at national scale would mean simulating every reanalysis grid cell, weighting by the actual turbine-fleet distribution, and bias-correcting against metered national output — data- and compute-intensive work that Renewables.ninja has already performed. It is far more efficient to reuse its already-computed point outputs at representative locations.</w:t>
       </w:r>
     </w:p>
     <w:p>
@@ -172,15 +125,7 @@
       </w:r>
       <w:proofErr w:type="gramEnd"/>
       <w:r>
-        <w:t xml:space="preserve"> we read the </w:t>
-      </w:r>
-      <w:proofErr w:type="spellStart"/>
-      <w:r>
-        <w:t>Renewables.ninja</w:t>
-      </w:r>
-      <w:proofErr w:type="spellEnd"/>
-      <w:r>
-        <w:t xml:space="preserve"> wind simulation output for hand-picked sites in each country's main wind regions (hub-height, power-curve, bias-corrected; fetched with capacity = 1 so the electricity column </w:t>
+        <w:t xml:space="preserve"> we read the Renewables.ninja wind simulation output for hand-picked sites in each country's main wind regions (hub-height, power-curve, bias-corrected; fetched with capacity = 1 so the electricity column </w:t>
       </w:r>
       <w:r>
         <w:rPr>
@@ -208,17 +153,12 @@
       </w:r>
       <w:proofErr w:type="gramEnd"/>
       <w:r>
-        <w:t xml:space="preserve"> should create their own </w:t>
-      </w:r>
-      <w:proofErr w:type="spellStart"/>
-      <w:r>
-        <w:t>Renewables</w:t>
+        <w:t xml:space="preserve"> should create their own Renewables</w:t>
       </w:r>
       <w:proofErr w:type="gramStart"/>
       <w:r>
         <w:t>.ninja</w:t>
       </w:r>
-      <w:proofErr w:type="spellEnd"/>
       <w:proofErr w:type="gramEnd"/>
       <w:r>
         <w:t xml:space="preserve"> login to allow for 50 downloads per hour. </w:t>
@@ -237,6 +177,9 @@
         <w:keepNext/>
       </w:pPr>
       <w:r>
+        <w:rPr>
+          <w:noProof/>
+        </w:rPr>
         <w:drawing>
           <wp:inline distT="0" distB="0" distL="0" distR="0" wp14:anchorId="2F19EA88" wp14:editId="7A03A6A6">
             <wp:extent cx="5943600" cy="2433955"/>
@@ -281,24 +224,14 @@
       <w:r>
         <w:t xml:space="preserve">Figure </w:t>
       </w:r>
-      <w:r>
-        <w:fldChar w:fldCharType="begin"/>
-      </w:r>
-      <w:r>
-        <w:instrText xml:space="preserve"> SEQ Figure \* ARABIC </w:instrText>
-      </w:r>
-      <w:r>
-        <w:fldChar w:fldCharType="separate"/>
-      </w:r>
-      <w:r>
-        <w:rPr>
-          <w:noProof/>
-        </w:rPr>
-        <w:t>2</w:t>
-      </w:r>
-      <w:r>
-        <w:fldChar w:fldCharType="end"/>
-      </w:r>
+      <w:fldSimple w:instr=" SEQ Figure \* ARABIC ">
+        <w:r>
+          <w:rPr>
+            <w:noProof/>
+          </w:rPr>
+          <w:t>2</w:t>
+        </w:r>
+      </w:fldSimple>
       <w:r>
         <w:t xml:space="preserve"> Example API token found under user profile. This gets saved in </w:t>
       </w:r>
@@ -307,17 +240,12 @@
       </w:r>
       <w:proofErr w:type="gramStart"/>
       <w:r>
-        <w:t>/.</w:t>
-      </w:r>
-      <w:proofErr w:type="spellStart"/>
-      <w:r>
-        <w:t>ninja</w:t>
+        <w:t>/.ninja</w:t>
       </w:r>
       <w:proofErr w:type="gramEnd"/>
       <w:r>
         <w:t>_token</w:t>
       </w:r>
-      <w:proofErr w:type="spellEnd"/>
     </w:p>
     <w:p>
       <w:r>
@@ -419,16 +347,8 @@
         <w:rPr>
           <w:u w:val="single"/>
         </w:rPr>
-        <w:t xml:space="preserve">Representative Sites from </w:t>
-      </w:r>
-      <w:proofErr w:type="spellStart"/>
-      <w:r>
-        <w:rPr>
-          <w:u w:val="single"/>
-        </w:rPr>
-        <w:t>Renewables.Ninja</w:t>
-      </w:r>
-      <w:proofErr w:type="spellEnd"/>
+        <w:t>Representative Sites from Renewables.Ninja</w:t>
+      </w:r>
       <w:r>
         <w:rPr>
           <w:u w:val="single"/>
@@ -620,34 +540,24 @@
           <w:u w:val="single"/>
         </w:rPr>
         <w:lastRenderedPageBreak/>
-        <w:t xml:space="preserve">Representative Sites from </w:t>
-      </w:r>
-      <w:proofErr w:type="spellStart"/>
+        <w:t>Representative Sites from Renewables.Ninja</w:t>
+      </w:r>
       <w:r>
         <w:rPr>
           <w:u w:val="single"/>
         </w:rPr>
-        <w:t>Renewables.Ninja</w:t>
-      </w:r>
-      <w:proofErr w:type="spellEnd"/>
-      <w:r>
-        <w:rPr>
-          <w:u w:val="single"/>
-        </w:rPr>
         <w:t xml:space="preserve"> in South Korea</w:t>
       </w:r>
     </w:p>
     <w:p/>
-    <w:p>
-      <w:r>
-        <w:rPr>
-          <w:noProof/>
-        </w:rPr>
+    <w:p/>
+    <w:p>
+      <w:r>
         <w:drawing>
-          <wp:inline distT="0" distB="0" distL="0" distR="0" wp14:anchorId="7A532284" wp14:editId="0700EC2A">
-            <wp:extent cx="5943600" cy="6529705"/>
-            <wp:effectExtent l="0" t="0" r="0" b="4445"/>
-            <wp:docPr id="915607121" name="Picture 1"/>
+          <wp:inline distT="0" distB="0" distL="0" distR="0" wp14:anchorId="3CF0A753" wp14:editId="56C52D85">
+            <wp:extent cx="5423095" cy="5816213"/>
+            <wp:effectExtent l="0" t="0" r="6350" b="0"/>
+            <wp:docPr id="1079715954" name="Picture 1"/>
             <wp:cNvGraphicFramePr>
               <a:graphicFrameLocks xmlns:a="http://schemas.openxmlformats.org/drawingml/2006/main" noChangeAspect="1"/>
             </wp:cNvGraphicFramePr>
@@ -655,23 +565,32 @@
               <a:graphicData uri="http://schemas.openxmlformats.org/drawingml/2006/picture">
                 <pic:pic xmlns:pic="http://schemas.openxmlformats.org/drawingml/2006/picture">
                   <pic:nvPicPr>
-                    <pic:cNvPr id="915607121" name=""/>
+                    <pic:cNvPr id="1079715954" name=""/>
                     <pic:cNvPicPr/>
                   </pic:nvPicPr>
-                  <pic:blipFill>
+                  <pic:blipFill rotWithShape="1">
                     <a:blip r:embed="rId14"/>
+                    <a:srcRect l="10487" r="13226"/>
                     <a:stretch>
                       <a:fillRect/>
                     </a:stretch>
                   </pic:blipFill>
-                  <pic:spPr>
+                  <pic:spPr bwMode="auto">
                     <a:xfrm>
                       <a:off x="0" y="0"/>
-                      <a:ext cx="5943600" cy="6529705"/>
+                      <a:ext cx="5428329" cy="5821827"/>
                     </a:xfrm>
                     <a:prstGeom prst="rect">
                       <a:avLst/>
                     </a:prstGeom>
+                    <a:ln>
+                      <a:noFill/>
+                    </a:ln>
+                    <a:extLst>
+                      <a:ext uri="{53640926-AAD7-44D8-BBD7-CCE9431645EC}">
+                        <a14:shadowObscured xmlns:a14="http://schemas.microsoft.com/office/drawing/2010/main"/>
+                      </a:ext>
+                    </a:extLst>
                   </pic:spPr>
                 </pic:pic>
               </a:graphicData>
@@ -691,7 +610,7 @@
 </file>
 
 <file path=word/endnotes.xml><?xml version="1.0" encoding="utf-8"?>
-<w:endnotes xmlns:wpc="http://schemas.microsoft.com/office/word/2010/wordprocessingCanvas" xmlns:cx="http://schemas.microsoft.com/office/drawing/2014/chartex" xmlns:cx1="http://schemas.microsoft.com/office/drawing/2015/9/8/chartex" xmlns:cx2="http://schemas.microsoft.com/office/drawing/2015/10/21/chartex" xmlns:cx3="http://schemas.microsoft.com/office/drawing/2016/5/9/chartex" xmlns:cx4="http://schemas.microsoft.com/office/drawing/2016/5/10/chartex" xmlns:cx5="http://schemas.microsoft.com/office/drawing/2016/5/11/chartex" xmlns:cx6="http://schemas.microsoft.com/office/drawing/2016/5/12/chartex" xmlns:cx7="http://schemas.microsoft.com/office/drawing/2016/5/13/chartex" xmlns:cx8="http://schemas.microsoft.com/office/drawing/2016/5/14/chartex" xmlns:mc="http://schemas.openxmlformats.org/markup-compatibility/2006" xmlns:aink="http://schemas.microsoft.com/office/drawing/2016/ink" xmlns:am3d="http://schemas.microsoft.com/office/drawing/2017/model3d" xmlns:o="urn:schemas-microsoft-com:office:office" xmlns:oel="http://schemas.microsoft.com/office/2019/extlst" xmlns:r="http://schemas.openxmlformats.org/officeDocument/2006/relationships" xmlns:m="http://schemas.openxmlformats.org/officeDocument/2006/math" xmlns:v="urn:schemas-microsoft-com:vml" xmlns:wp14="http://schemas.microsoft.com/office/word/2010/wordprocessingDrawing" xmlns:wp="http://schemas.openxmlformats.org/drawingml/2006/wordprocessingDrawing" xmlns:w10="urn:schemas-microsoft-com:office:word" xmlns:w="http://schemas.openxmlformats.org/wordprocessingml/2006/main" xmlns:w14="http://schemas.microsoft.com/office/word/2010/wordml" xmlns:w15="http://schemas.microsoft.com/office/word/2012/wordml" xmlns:w16cex="http://schemas.microsoft.com/office/word/2018/wordml/cex" xmlns:w16cid="http://schemas.microsoft.com/office/word/2016/wordml/cid" xmlns:w16="http://schemas.microsoft.com/office/word/2018/wordml" xmlns:w16du="http://schemas.microsoft.com/office/word/2023/wordml/word16du" xmlns:w16sdtdh="http://schemas.microsoft.com/office/word/2020/wordml/sdtdatahash" xmlns:w16sdtfl="http://schemas.microsoft.com/office/word/2024/wordml/sdtformatlock" xmlns:w16se="http://schemas.microsoft.com/office/word/2015/wordml/symex" xmlns:wpg="http://schemas.microsoft.com/office/word/2010/wordprocessingGroup" xmlns:wpi="http://schemas.microsoft.com/office/word/2010/wordprocessingInk" xmlns:wne="http://schemas.microsoft.com/office/word/2006/wordml" xmlns:wps="http://schemas.microsoft.com/office/word/2010/wordprocessingShape" mc:Ignorable="w14 w15 w16se w16cid w16 w16cex w16sdtdh w16sdtfl w16du wp14">
+<w:endnotes xmlns:wpc="http://schemas.microsoft.com/office/word/2010/wordprocessingCanvas" xmlns:cx="http://schemas.microsoft.com/office/drawing/2014/chartex" xmlns:cx1="http://schemas.microsoft.com/office/drawing/2015/9/8/chartex" xmlns:cx2="http://schemas.microsoft.com/office/drawing/2015/10/21/chartex" xmlns:cx3="http://schemas.microsoft.com/office/drawing/2016/5/9/chartex" xmlns:cx4="http://schemas.microsoft.com/office/drawing/2016/5/10/chartex" xmlns:cx5="http://schemas.microsoft.com/office/drawing/2016/5/11/chartex" xmlns:cx6="http://schemas.microsoft.com/office/drawing/2016/5/12/chartex" xmlns:cx7="http://schemas.microsoft.com/office/drawing/2016/5/13/chartex" xmlns:cx8="http://schemas.microsoft.com/office/drawing/2016/5/14/chartex" xmlns:mc="http://schemas.openxmlformats.org/markup-compatibility/2006" xmlns:aink="http://schemas.microsoft.com/office/drawing/2016/ink" xmlns:am3d="http://schemas.microsoft.com/office/drawing/2017/model3d" xmlns:o="urn:schemas-microsoft-com:office:office" xmlns:oel="http://schemas.microsoft.com/office/2019/extlst" xmlns:r="http://schemas.openxmlformats.org/officeDocument/2006/relationships" xmlns:m="http://schemas.openxmlformats.org/officeDocument/2006/math" xmlns:v="urn:schemas-microsoft-com:vml" xmlns:wp14="http://schemas.microsoft.com/office/word/2010/wordprocessingDrawing" xmlns:wp="http://schemas.openxmlformats.org/drawingml/2006/wordprocessingDrawing" xmlns:w10="urn:schemas-microsoft-com:office:word" xmlns:w="http://schemas.openxmlformats.org/wordprocessingml/2006/main" xmlns:w14="http://schemas.microsoft.com/office/word/2010/wordml" xmlns:w15="http://schemas.microsoft.com/office/word/2012/wordml" xmlns:w16cei="http://schemas.microsoft.com/office/word/2026/wordml/cei" xmlns:w16cex="http://schemas.microsoft.com/office/word/2018/wordml/cex" xmlns:w16cid="http://schemas.microsoft.com/office/word/2016/wordml/cid" xmlns:w16="http://schemas.microsoft.com/office/word/2018/wordml" xmlns:w16du="http://schemas.microsoft.com/office/word/2023/wordml/word16du" xmlns:w16sdtdh="http://schemas.microsoft.com/office/word/2020/wordml/sdtdatahash" xmlns:w16sdtfl="http://schemas.microsoft.com/office/word/2024/wordml/sdtformatlock" xmlns:w16se="http://schemas.microsoft.com/office/word/2015/wordml/symex" xmlns:wpg="http://schemas.microsoft.com/office/word/2010/wordprocessingGroup" xmlns:wpi="http://schemas.microsoft.com/office/word/2010/wordprocessingInk" xmlns:wne="http://schemas.microsoft.com/office/word/2006/wordml" xmlns:wps="http://schemas.microsoft.com/office/word/2010/wordprocessingShape" mc:Ignorable="w14 w15 w16se w16cid w16 w16cex w16sdtdh w16sdtfl w16du wp14">
   <w:endnote w:type="separator" w:id="-1">
     <w:p>
       <w:pPr>
@@ -716,7 +635,7 @@
 </file>
 
 <file path=word/footnotes.xml><?xml version="1.0" encoding="utf-8"?>
-<w:footnotes xmlns:wpc="http://schemas.microsoft.com/office/word/2010/wordprocessingCanvas" xmlns:cx="http://schemas.microsoft.com/office/drawing/2014/chartex" xmlns:cx1="http://schemas.microsoft.com/office/drawing/2015/9/8/chartex" xmlns:cx2="http://schemas.microsoft.com/office/drawing/2015/10/21/chartex" xmlns:cx3="http://schemas.microsoft.com/office/drawing/2016/5/9/chartex" xmlns:cx4="http://schemas.microsoft.com/office/drawing/2016/5/10/chartex" xmlns:cx5="http://schemas.microsoft.com/office/drawing/2016/5/11/chartex" xmlns:cx6="http://schemas.microsoft.com/office/drawing/2016/5/12/chartex" xmlns:cx7="http://schemas.microsoft.com/office/drawing/2016/5/13/chartex" xmlns:cx8="http://schemas.microsoft.com/office/drawing/2016/5/14/chartex" xmlns:mc="http://schemas.openxmlformats.org/markup-compatibility/2006" xmlns:aink="http://schemas.microsoft.com/office/drawing/2016/ink" xmlns:am3d="http://schemas.microsoft.com/office/drawing/2017/model3d" xmlns:o="urn:schemas-microsoft-com:office:office" xmlns:oel="http://schemas.microsoft.com/office/2019/extlst" xmlns:r="http://schemas.openxmlformats.org/officeDocument/2006/relationships" xmlns:m="http://schemas.openxmlformats.org/officeDocument/2006/math" xmlns:v="urn:schemas-microsoft-com:vml" xmlns:wp14="http://schemas.microsoft.com/office/word/2010/wordprocessingDrawing" xmlns:wp="http://schemas.openxmlformats.org/drawingml/2006/wordprocessingDrawing" xmlns:w10="urn:schemas-microsoft-com:office:word" xmlns:w="http://schemas.openxmlformats.org/wordprocessingml/2006/main" xmlns:w14="http://schemas.microsoft.com/office/word/2010/wordml" xmlns:w15="http://schemas.microsoft.com/office/word/2012/wordml" xmlns:w16cex="http://schemas.microsoft.com/office/word/2018/wordml/cex" xmlns:w16cid="http://schemas.microsoft.com/office/word/2016/wordml/cid" xmlns:w16="http://schemas.microsoft.com/office/word/2018/wordml" xmlns:w16du="http://schemas.microsoft.com/office/word/2023/wordml/word16du" xmlns:w16sdtdh="http://schemas.microsoft.com/office/word/2020/wordml/sdtdatahash" xmlns:w16sdtfl="http://schemas.microsoft.com/office/word/2024/wordml/sdtformatlock" xmlns:w16se="http://schemas.microsoft.com/office/word/2015/wordml/symex" xmlns:wpg="http://schemas.microsoft.com/office/word/2010/wordprocessingGroup" xmlns:wpi="http://schemas.microsoft.com/office/word/2010/wordprocessingInk" xmlns:wne="http://schemas.microsoft.com/office/word/2006/wordml" xmlns:wps="http://schemas.microsoft.com/office/word/2010/wordprocessingShape" mc:Ignorable="w14 w15 w16se w16cid w16 w16cex w16sdtdh w16sdtfl w16du wp14">
+<w:footnotes xmlns:wpc="http://schemas.microsoft.com/office/word/2010/wordprocessingCanvas" xmlns:cx="http://schemas.microsoft.com/office/drawing/2014/chartex" xmlns:cx1="http://schemas.microsoft.com/office/drawing/2015/9/8/chartex" xmlns:cx2="http://schemas.microsoft.com/office/drawing/2015/10/21/chartex" xmlns:cx3="http://schemas.microsoft.com/office/drawing/2016/5/9/chartex" xmlns:cx4="http://schemas.microsoft.com/office/drawing/2016/5/10/chartex" xmlns:cx5="http://schemas.microsoft.com/office/drawing/2016/5/11/chartex" xmlns:cx6="http://schemas.microsoft.com/office/drawing/2016/5/12/chartex" xmlns:cx7="http://schemas.microsoft.com/office/drawing/2016/5/13/chartex" xmlns:cx8="http://schemas.microsoft.com/office/drawing/2016/5/14/chartex" xmlns:mc="http://schemas.openxmlformats.org/markup-compatibility/2006" xmlns:aink="http://schemas.microsoft.com/office/drawing/2016/ink" xmlns:am3d="http://schemas.microsoft.com/office/drawing/2017/model3d" xmlns:o="urn:schemas-microsoft-com:office:office" xmlns:oel="http://schemas.microsoft.com/office/2019/extlst" xmlns:r="http://schemas.openxmlformats.org/officeDocument/2006/relationships" xmlns:m="http://schemas.openxmlformats.org/officeDocument/2006/math" xmlns:v="urn:schemas-microsoft-com:vml" xmlns:wp14="http://schemas.microsoft.com/office/word/2010/wordprocessingDrawing" xmlns:wp="http://schemas.openxmlformats.org/drawingml/2006/wordprocessingDrawing" xmlns:w10="urn:schemas-microsoft-com:office:word" xmlns:w="http://schemas.openxmlformats.org/wordprocessingml/2006/main" xmlns:w14="http://schemas.microsoft.com/office/word/2010/wordml" xmlns:w15="http://schemas.microsoft.com/office/word/2012/wordml" xmlns:w16cei="http://schemas.microsoft.com/office/word/2026/wordml/cei" xmlns:w16cex="http://schemas.microsoft.com/office/word/2018/wordml/cex" xmlns:w16cid="http://schemas.microsoft.com/office/word/2016/wordml/cid" xmlns:w16="http://schemas.microsoft.com/office/word/2018/wordml" xmlns:w16du="http://schemas.microsoft.com/office/word/2023/wordml/word16du" xmlns:w16sdtdh="http://schemas.microsoft.com/office/word/2020/wordml/sdtdatahash" xmlns:w16sdtfl="http://schemas.microsoft.com/office/word/2024/wordml/sdtformatlock" xmlns:w16se="http://schemas.microsoft.com/office/word/2015/wordml/symex" xmlns:wpg="http://schemas.microsoft.com/office/word/2010/wordprocessingGroup" xmlns:wpi="http://schemas.microsoft.com/office/word/2010/wordprocessingInk" xmlns:wne="http://schemas.microsoft.com/office/word/2006/wordml" xmlns:wps="http://schemas.microsoft.com/office/word/2010/wordprocessingShape" mc:Ignorable="w14 w15 w16se w16cid w16 w16cex w16sdtdh w16sdtfl w16du wp14">
   <w:footnote w:type="separator" w:id="-1">
     <w:p>
       <w:pPr>
@@ -1371,6 +1290,7 @@
   <w:style w:type="character" w:default="1" w:styleId="DefaultParagraphFont">
     <w:name w:val="Default Paragraph Font"/>
     <w:uiPriority w:val="1"/>
+    <w:semiHidden/>
     <w:unhideWhenUsed/>
   </w:style>
   <w:style w:type="table" w:default="1" w:styleId="TableNormal">

</xml_diff>